<commit_message>
feat: Several Small Refinements (#1755)
Co-authored-by: Ryan Rondeau <nayr974@users.noreply.github.com>
Co-authored-by: team-wolverine-nrm-repo-updater[bot] <203337993+team-wolverine-nrm-repo-updater[bot]@users.noreply.github.com>
</commit_message>
<xml_diff>
--- a/backend/templates/complaint/CDOGS-EXT-CEEB-COMPLAINT-TEMPLATE-v1.docx
+++ b/backend/templates/complaint/CDOGS-EXT-CEEB-COMPLAINT-TEMPLATE-v1.docx
@@ -787,8 +787,8 @@
         <w:tblLook w:val="04A0" w:firstRow="1" w:lastRow="0" w:firstColumn="1" w:lastColumn="0" w:noHBand="0" w:noVBand="1"/>
       </w:tblPr>
       <w:tblGrid>
-        <w:gridCol w:w="2635"/>
-        <w:gridCol w:w="8635"/>
+        <w:gridCol w:w="2552"/>
+        <w:gridCol w:w="8364"/>
       </w:tblGrid>
       <w:tr>
         <w:trPr>
@@ -842,9 +842,12 @@
             <w:r>
               <w:rPr>
                 <w:rStyle w:val="CommentReference"/>
-                <w:b w:val="0"/>
-                <w:bCs w:val="0"/>
-                <w:caps w:val="0"/>
+                <w:rFonts w:ascii="BC Sans" w:eastAsia="Times New Roman" w:hAnsi="BC Sans" w:cs="Times New Roman"/>
+                <w:color w:val="000000"/>
+                <w:kern w:val="0"/>
+                <w:sz w:val="20"/>
+                <w:szCs w:val="20"/>
+                <w14:ligatures w14:val="none"/>
               </w:rPr>
               <w:commentReference w:id="0"/>
             </w:r>
@@ -3461,7 +3464,7 @@
                 <w:sz w:val="20"/>
                 <w:szCs w:val="20"/>
               </w:rPr>
-              <w:t>Subject of complaint/</w:t>
+              <w:t>Party of interest</w:t>
             </w:r>
             <w:r>
               <w:rPr>
@@ -3473,19 +3476,7 @@
                 <w:sz w:val="20"/>
                 <w:szCs w:val="20"/>
               </w:rPr>
-              <w:t xml:space="preserve"> </w:t>
-            </w:r>
-            <w:r>
-              <w:rPr>
-                <w:rFonts w:ascii="BC Sans" w:eastAsia="BC Sans" w:hAnsi="BC Sans" w:cs="BC Sans"/>
-                <w:b w:val="0"/>
-                <w:bCs w:val="0"/>
-                <w:caps w:val="0"/>
-                <w:color w:val="000000" w:themeColor="text1"/>
-                <w:sz w:val="20"/>
-                <w:szCs w:val="20"/>
-              </w:rPr>
-              <w:t>witness details</w:t>
+              <w:t xml:space="preserve"> details</w:t>
             </w:r>
           </w:p>
         </w:tc>
@@ -3592,7 +3583,19 @@
                 <w:szCs w:val="20"/>
                 <w14:ligatures w14:val="none"/>
               </w:rPr>
-              <w:t>Caller information</w:t>
+              <w:t>Complainant</w:t>
+            </w:r>
+            <w:r>
+              <w:rPr>
+                <w:rFonts w:ascii="BC Sans" w:eastAsia="Times New Roman" w:hAnsi="BC Sans" w:cs="Times New Roman"/>
+                <w:caps w:val="0"/>
+                <w:color w:val="000000"/>
+                <w:kern w:val="0"/>
+                <w:sz w:val="20"/>
+                <w:szCs w:val="20"/>
+                <w14:ligatures w14:val="none"/>
+              </w:rPr>
+              <w:t xml:space="preserve"> information</w:t>
             </w:r>
           </w:p>
         </w:tc>
@@ -3766,6 +3769,9 @@
             <w:r>
               <w:rPr>
                 <w:rStyle w:val="CommentReference"/>
+                <w:rFonts w:ascii="BC Sans" w:hAnsi="BC Sans" w:cs="BC Sans Light"/>
+                <w:sz w:val="20"/>
+                <w:szCs w:val="20"/>
               </w:rPr>
               <w:commentReference w:id="1"/>
             </w:r>
@@ -4436,7 +4442,6 @@
                 <w:sz w:val="20"/>
                 <w:szCs w:val="20"/>
               </w:rPr>
-              <w:lastRenderedPageBreak/>
               <w:t>Email</w:t>
             </w:r>
           </w:p>
@@ -4523,6 +4528,7 @@
                 <w:sz w:val="20"/>
                 <w:szCs w:val="20"/>
               </w:rPr>
+              <w:lastRenderedPageBreak/>
               <w:t>Organization reporting the complaint</w:t>
             </w:r>
           </w:p>
@@ -7446,7 +7452,6 @@
                 <w:sz w:val="20"/>
                 <w:szCs w:val="20"/>
               </w:rPr>
-              <w:lastRenderedPageBreak/>
               <w:t>Authorization category {d.authCat[i]}</w:t>
             </w:r>
           </w:p>
@@ -7525,6 +7530,7 @@
                 <w:sz w:val="20"/>
                 <w:szCs w:val="20"/>
               </w:rPr>
+              <w:lastRenderedPageBreak/>
               <w:t>Authorization category {d.authCat[i]+1}</w:t>
             </w:r>
           </w:p>
@@ -11802,33 +11808,6 @@
 </file>
 
 <file path=customXml/item1.xml><?xml version="1.0" encoding="utf-8"?>
-<?mso-contentType ?>
-<FormTemplates xmlns="http://schemas.microsoft.com/sharepoint/v3/contenttype/forms">
-  <Display>DocumentLibraryForm</Display>
-  <Edit>DocumentLibraryForm</Edit>
-  <New>DocumentLibraryForm</New>
-</FormTemplates>
-</file>
-
-<file path=customXml/item2.xml><?xml version="1.0" encoding="utf-8"?>
-<p:properties xmlns:p="http://schemas.microsoft.com/office/2006/metadata/properties" xmlns:xsi="http://www.w3.org/2001/XMLSchema-instance" xmlns:pc="http://schemas.microsoft.com/office/infopath/2007/PartnerControls">
-  <documentManagement>
-    <TaxCatchAll xmlns="cbeac988-4fd5-47cf-ad03-89cc7678fa90" xsi:nil="true"/>
-    <lcf76f155ced4ddcb4097134ff3c332f xmlns="aa9c99c1-69c1-4b58-9df5-4d4796c46f8a">
-      <Terms xmlns="http://schemas.microsoft.com/office/infopath/2007/PartnerControls"/>
-    </lcf76f155ced4ddcb4097134ff3c332f>
-    <SharedWithUsers xmlns="cbeac988-4fd5-47cf-ad03-89cc7678fa90">
-      <UserInfo>
-        <DisplayName/>
-        <AccountId xsi:nil="true"/>
-        <AccountType/>
-      </UserInfo>
-    </SharedWithUsers>
-  </documentManagement>
-</p:properties>
-</file>
-
-<file path=customXml/item3.xml><?xml version="1.0" encoding="utf-8"?>
 <ct:contentTypeSchema xmlns:ct="http://schemas.microsoft.com/office/2006/metadata/contentType" xmlns:ma="http://schemas.microsoft.com/office/2006/metadata/properties/metaAttributes" ct:_="" ma:_="" ma:contentTypeName="Document" ma:contentTypeID="0x010100ED0089B3ED392A4CB3C10705735CFAD3" ma:contentTypeVersion="15" ma:contentTypeDescription="Create a new document." ma:contentTypeScope="" ma:versionID="e9715c4352d5d9c94cf397f6db7911f6">
   <xsd:schema xmlns:xsd="http://www.w3.org/2001/XMLSchema" xmlns:xs="http://www.w3.org/2001/XMLSchema" xmlns:p="http://schemas.microsoft.com/office/2006/metadata/properties" xmlns:ns2="aa9c99c1-69c1-4b58-9df5-4d4796c46f8a" xmlns:ns3="cbeac988-4fd5-47cf-ad03-89cc7678fa90" targetNamespace="http://schemas.microsoft.com/office/2006/metadata/properties" ma:root="true" ma:fieldsID="4a7b24a40f906d6832371abf7aef78d6" ns2:_="" ns3:_="">
     <xsd:import namespace="aa9c99c1-69c1-4b58-9df5-4d4796c46f8a"/>
@@ -12063,10 +12042,48 @@
 </ct:contentTypeSchema>
 </file>
 
+<file path=customXml/item2.xml><?xml version="1.0" encoding="utf-8"?>
+<p:properties xmlns:p="http://schemas.microsoft.com/office/2006/metadata/properties" xmlns:xsi="http://www.w3.org/2001/XMLSchema-instance" xmlns:pc="http://schemas.microsoft.com/office/infopath/2007/PartnerControls">
+  <documentManagement>
+    <TaxCatchAll xmlns="cbeac988-4fd5-47cf-ad03-89cc7678fa90" xsi:nil="true"/>
+    <lcf76f155ced4ddcb4097134ff3c332f xmlns="aa9c99c1-69c1-4b58-9df5-4d4796c46f8a">
+      <Terms xmlns="http://schemas.microsoft.com/office/infopath/2007/PartnerControls"/>
+    </lcf76f155ced4ddcb4097134ff3c332f>
+    <SharedWithUsers xmlns="cbeac988-4fd5-47cf-ad03-89cc7678fa90">
+      <UserInfo>
+        <DisplayName/>
+        <AccountId xsi:nil="true"/>
+        <AccountType/>
+      </UserInfo>
+    </SharedWithUsers>
+  </documentManagement>
+</p:properties>
+</file>
+
+<file path=customXml/item3.xml><?xml version="1.0" encoding="utf-8"?>
+<?mso-contentType ?>
+<FormTemplates xmlns="http://schemas.microsoft.com/sharepoint/v3/contenttype/forms">
+  <Display>DocumentLibraryForm</Display>
+  <Edit>DocumentLibraryForm</Edit>
+  <New>DocumentLibraryForm</New>
+</FormTemplates>
+</file>
+
 <file path=customXml/itemProps1.xml><?xml version="1.0" encoding="utf-8"?>
-<ds:datastoreItem xmlns:ds="http://schemas.openxmlformats.org/officeDocument/2006/customXml" ds:itemID="{4BECF9F2-3A10-48CC-8D31-4F6E8664527E}">
+<ds:datastoreItem xmlns:ds="http://schemas.openxmlformats.org/officeDocument/2006/customXml" ds:itemID="{26FF9410-7F49-4DD5-9478-D670A139DF54}">
   <ds:schemaRefs>
-    <ds:schemaRef ds:uri="http://schemas.microsoft.com/sharepoint/v3/contenttype/forms"/>
+    <ds:schemaRef ds:uri="http://schemas.microsoft.com/office/2006/metadata/contentType"/>
+    <ds:schemaRef ds:uri="http://schemas.microsoft.com/office/2006/metadata/properties/metaAttributes"/>
+    <ds:schemaRef ds:uri="http://www.w3.org/2001/XMLSchema"/>
+    <ds:schemaRef ds:uri="http://schemas.microsoft.com/office/2006/metadata/properties"/>
+    <ds:schemaRef ds:uri="aa9c99c1-69c1-4b58-9df5-4d4796c46f8a"/>
+    <ds:schemaRef ds:uri="cbeac988-4fd5-47cf-ad03-89cc7678fa90"/>
+    <ds:schemaRef ds:uri="http://schemas.microsoft.com/office/2006/documentManagement/types"/>
+    <ds:schemaRef ds:uri="http://schemas.microsoft.com/office/infopath/2007/PartnerControls"/>
+    <ds:schemaRef ds:uri="http://schemas.openxmlformats.org/package/2006/metadata/core-properties"/>
+    <ds:schemaRef ds:uri="http://purl.org/dc/elements/1.1/"/>
+    <ds:schemaRef ds:uri="http://purl.org/dc/terms/"/>
+    <ds:schemaRef ds:uri="http://schemas.microsoft.com/internal/obd"/>
   </ds:schemaRefs>
 </ds:datastoreItem>
 </file>
@@ -12083,20 +12100,9 @@
 </file>
 
 <file path=customXml/itemProps3.xml><?xml version="1.0" encoding="utf-8"?>
-<ds:datastoreItem xmlns:ds="http://schemas.openxmlformats.org/officeDocument/2006/customXml" ds:itemID="{26FF9410-7F49-4DD5-9478-D670A139DF54}">
+<ds:datastoreItem xmlns:ds="http://schemas.openxmlformats.org/officeDocument/2006/customXml" ds:itemID="{4BECF9F2-3A10-48CC-8D31-4F6E8664527E}">
   <ds:schemaRefs>
-    <ds:schemaRef ds:uri="http://schemas.microsoft.com/office/2006/metadata/contentType"/>
-    <ds:schemaRef ds:uri="http://schemas.microsoft.com/office/2006/metadata/properties/metaAttributes"/>
-    <ds:schemaRef ds:uri="http://www.w3.org/2001/XMLSchema"/>
-    <ds:schemaRef ds:uri="http://schemas.microsoft.com/office/2006/metadata/properties"/>
-    <ds:schemaRef ds:uri="aa9c99c1-69c1-4b58-9df5-4d4796c46f8a"/>
-    <ds:schemaRef ds:uri="cbeac988-4fd5-47cf-ad03-89cc7678fa90"/>
-    <ds:schemaRef ds:uri="http://schemas.microsoft.com/office/2006/documentManagement/types"/>
-    <ds:schemaRef ds:uri="http://schemas.microsoft.com/office/infopath/2007/PartnerControls"/>
-    <ds:schemaRef ds:uri="http://schemas.openxmlformats.org/package/2006/metadata/core-properties"/>
-    <ds:schemaRef ds:uri="http://purl.org/dc/elements/1.1/"/>
-    <ds:schemaRef ds:uri="http://purl.org/dc/terms/"/>
-    <ds:schemaRef ds:uri="http://schemas.microsoft.com/internal/obd"/>
+    <ds:schemaRef ds:uri="http://schemas.microsoft.com/sharepoint/v3/contenttype/forms"/>
   </ds:schemaRefs>
 </ds:datastoreItem>
 </file>
</xml_diff>